<commit_message>
fix(release): harden docs reproducibility and overrides
</commit_message>
<xml_diff>
--- a/docs/friend/word/Lodestone-Installation-Guide.docx
+++ b/docs/friend/word/Lodestone-Installation-Guide.docx
@@ -1406,6 +1406,47 @@
       </w:pPr>
       <w:r>
         <w:t xml:space="preserve">Runs the first indexing pass.</w:t>
+      </w:r>
+    </w:p>
+    <w:p>
+      <w:pPr>
+        <w:pStyle w:val="FirstParagraph"/>
+      </w:pPr>
+      <w:r>
+        <w:t xml:space="preserve">Advanced operators can set</w:t>
+      </w:r>
+      <w:r>
+        <w:t xml:space="preserve"> </w:t>
+      </w:r>
+      <w:r>
+        <w:rPr>
+          <w:rStyle w:val="VerbatimChar"/>
+        </w:rPr>
+        <w:t xml:space="preserve">LODESTONE_STRICT_NPM_OVERRIDES=1</w:t>
+      </w:r>
+      <w:r>
+        <w:t xml:space="preserve"> </w:t>
+      </w:r>
+      <w:r>
+        <w:t xml:space="preserve">when installing</w:t>
+      </w:r>
+      <w:r>
+        <w:t xml:space="preserve"> </w:t>
+      </w:r>
+      <w:r>
+        <w:t xml:space="preserve">into an existing project with an old lockfile. Do not use that option unless</w:t>
+      </w:r>
+      <w:r>
+        <w:t xml:space="preserve"> </w:t>
+      </w:r>
+      <w:r>
+        <w:t xml:space="preserve">you specifically want Lodestone to add stricter root dependency overrides to</w:t>
+      </w:r>
+      <w:r>
+        <w:t xml:space="preserve"> </w:t>
+      </w:r>
+      <w:r>
+        <w:t xml:space="preserve">the project.</w:t>
       </w:r>
     </w:p>
     <w:bookmarkEnd w:id="26"/>

</xml_diff>

<commit_message>
feat(mcpb): add Claude Desktop bundle packer
</commit_message>
<xml_diff>
--- a/docs/friend/word/Lodestone-Installation-Guide.docx
+++ b/docs/friend/word/Lodestone-Installation-Guide.docx
@@ -2,7 +2,7 @@
 <file path=word/document.xml><?xml version="1.0" encoding="utf-8"?>
 <w:document xmlns:w="http://schemas.openxmlformats.org/wordprocessingml/2006/main" xmlns:m="http://schemas.openxmlformats.org/officeDocument/2006/math" xmlns:r="http://schemas.openxmlformats.org/officeDocument/2006/relationships" xmlns:o="urn:schemas-microsoft-com:office:office" xmlns:v="urn:schemas-microsoft-com:vml" xmlns:w10="urn:schemas-microsoft-com:office:word" xmlns:a="http://schemas.openxmlformats.org/drawingml/2006/main" xmlns:pic="http://schemas.openxmlformats.org/drawingml/2006/picture" xmlns:wp="http://schemas.openxmlformats.org/drawingml/2006/wordprocessingDrawing">
   <w:body>
-    <w:bookmarkStart w:id="41" w:name="lodestone-installation-guide"/>
+    <w:bookmarkStart w:id="42" w:name="lodestone-installation-guide"/>
     <w:p>
       <w:pPr>
         <w:pStyle w:val="Heading1"/>
@@ -864,7 +864,7 @@
       </w:r>
     </w:p>
     <w:bookmarkEnd w:id="24"/>
-    <w:bookmarkStart w:id="25" w:name="optional-codex-adapter"/>
+    <w:bookmarkStart w:id="26" w:name="optional-codex-adapter"/>
     <w:p>
       <w:pPr>
         <w:pStyle w:val="Heading2"/>
@@ -1204,8 +1204,59 @@
         <w:t xml:space="preserve"> codex</w:t>
       </w:r>
     </w:p>
+    <w:bookmarkStart w:id="25" w:name="claude-desktop-mcpb-option"/>
+    <w:p>
+      <w:pPr>
+        <w:pStyle w:val="Heading3"/>
+      </w:pPr>
+      <w:r>
+        <w:t xml:space="preserve">Claude Desktop MCPB Option</w:t>
+      </w:r>
+    </w:p>
+    <w:p>
+      <w:pPr>
+        <w:pStyle w:val="FirstParagraph"/>
+      </w:pPr>
+      <w:r>
+        <w:t xml:space="preserve">Claude Desktop users who prefer a one-click extension can use a private</w:t>
+      </w:r>
+      <w:r>
+        <w:t xml:space="preserve"> </w:t>
+      </w:r>
+      <w:r>
+        <w:t xml:space="preserve">current-platform MCPB bundle after Lodestone has already been installed and</w:t>
+      </w:r>
+      <w:r>
+        <w:t xml:space="preserve"> </w:t>
+      </w:r>
+      <w:r>
+        <w:t xml:space="preserve">indexed in the target project. See</w:t>
+      </w:r>
+      <w:r>
+        <w:t xml:space="preserve"> </w:t>
+      </w:r>
+      <w:r>
+        <w:rPr>
+          <w:rStyle w:val="VerbatimChar"/>
+        </w:rPr>
+        <w:t xml:space="preserve">docs/MCPB.md</w:t>
+      </w:r>
+      <w:r>
+        <w:t xml:space="preserve"> </w:t>
+      </w:r>
+      <w:r>
+        <w:t xml:space="preserve">or the online docs page for</w:t>
+      </w:r>
+      <w:r>
+        <w:t xml:space="preserve"> </w:t>
+      </w:r>
+      <w:r>
+        <w:t xml:space="preserve">the bundle build and install steps.</w:t>
+      </w:r>
+    </w:p>
     <w:bookmarkEnd w:id="25"/>
-    <w:bookmarkStart w:id="26" w:name="what-the-installer-does"/>
+    <w:bookmarkEnd w:id="26"/>
+    <w:bookmarkStart w:id="27" w:name="what-the-installer-does"/>
     <w:p>
       <w:pPr>
         <w:pStyle w:val="Heading2"/>
@@ -1449,8 +1500,8 @@
         <w:t xml:space="preserve">the project.</w:t>
       </w:r>
     </w:p>
-    <w:bookmarkEnd w:id="26"/>
-    <w:bookmarkStart w:id="27" w:name="what-files-are-created"/>
+    <w:bookmarkEnd w:id="27"/>
+    <w:bookmarkStart w:id="28" w:name="what-files-are-created"/>
     <w:p>
       <w:pPr>
         <w:pStyle w:val="Heading2"/>
@@ -1775,8 +1826,8 @@
         <w:t xml:space="preserve">already exists, Lodestone updates them conservatively.</w:t>
       </w:r>
     </w:p>
-    <w:bookmarkEnd w:id="27"/>
-    <w:bookmarkStart w:id="28" w:name="after-install"/>
+    <w:bookmarkEnd w:id="28"/>
+    <w:bookmarkStart w:id="29" w:name="after-install"/>
     <w:p>
       <w:pPr>
         <w:pStyle w:val="Heading2"/>
@@ -1856,8 +1907,8 @@
         <w:t xml:space="preserve">what project-specific patterns should I follow before editing tests?</w:t>
       </w:r>
     </w:p>
-    <w:bookmarkEnd w:id="28"/>
-    <w:bookmarkStart w:id="29" w:name="where-to-find-the-documentation"/>
+    <w:bookmarkEnd w:id="29"/>
+    <w:bookmarkStart w:id="30" w:name="where-to-find-the-documentation"/>
     <w:p>
       <w:pPr>
         <w:pStyle w:val="Heading2"/>
@@ -1941,8 +1992,8 @@
         <w:t xml:space="preserve">docs/README.md</w:t>
       </w:r>
     </w:p>
-    <w:bookmarkEnd w:id="29"/>
-    <w:bookmarkStart w:id="30" w:name="how-to-confirm-it-worked"/>
+    <w:bookmarkEnd w:id="30"/>
+    <w:bookmarkStart w:id="31" w:name="how-to-confirm-it-worked"/>
     <w:p>
       <w:pPr>
         <w:pStyle w:val="Heading2"/>
@@ -2145,8 +2196,8 @@
         <w:t xml:space="preserve"> codex</w:t>
       </w:r>
     </w:p>
-    <w:bookmarkEnd w:id="30"/>
-    <w:bookmarkStart w:id="31" w:name="updating-later"/>
+    <w:bookmarkEnd w:id="31"/>
+    <w:bookmarkStart w:id="32" w:name="updating-later"/>
     <w:p>
       <w:pPr>
         <w:pStyle w:val="Heading2"/>
@@ -2239,8 +2290,8 @@
         <w:t xml:space="preserve">installer.</w:t>
       </w:r>
     </w:p>
-    <w:bookmarkEnd w:id="31"/>
-    <w:bookmarkStart w:id="32" w:name="removing-lodestone"/>
+    <w:bookmarkEnd w:id="32"/>
+    <w:bookmarkStart w:id="33" w:name="removing-lodestone"/>
     <w:p>
       <w:pPr>
         <w:pStyle w:val="Heading2"/>
@@ -2328,8 +2379,8 @@
         <w:t xml:space="preserve">the branch using your normal Git workflow.</w:t>
       </w:r>
     </w:p>
-    <w:bookmarkEnd w:id="32"/>
-    <w:bookmarkStart w:id="39" w:name="troubleshooting"/>
+    <w:bookmarkEnd w:id="33"/>
+    <w:bookmarkStart w:id="40" w:name="troubleshooting"/>
     <w:p>
       <w:pPr>
         <w:pStyle w:val="Heading2"/>
@@ -2338,7 +2389,7 @@
         <w:t xml:space="preserve">Troubleshooting</w:t>
       </w:r>
     </w:p>
-    <w:bookmarkStart w:id="33" w:name="node-is-required"/>
+    <w:bookmarkStart w:id="34" w:name="node-is-required"/>
     <w:p>
       <w:pPr>
         <w:pStyle w:val="Heading3"/>
@@ -2355,8 +2406,8 @@
         <w:t xml:space="preserve">Install Node.js 20 or newer, then run the installer again.</w:t>
       </w:r>
     </w:p>
-    <w:bookmarkEnd w:id="33"/>
-    <w:bookmarkStart w:id="34" w:name="npm-is-required"/>
+    <w:bookmarkEnd w:id="34"/>
+    <w:bookmarkStart w:id="35" w:name="npm-is-required"/>
     <w:p>
       <w:pPr>
         <w:pStyle w:val="Heading3"/>
@@ -2373,8 +2424,8 @@
         <w:t xml:space="preserve">Install npm. It normally comes with Node.js.</w:t>
       </w:r>
     </w:p>
-    <w:bookmarkEnd w:id="34"/>
-    <w:bookmarkStart w:id="35" w:name="invalid-lodestone_profile"/>
+    <w:bookmarkEnd w:id="35"/>
+    <w:bookmarkStart w:id="36" w:name="invalid-lodestone_profile"/>
     <w:p>
       <w:pPr>
         <w:pStyle w:val="Heading3"/>
@@ -2411,8 +2462,8 @@
         <w:t xml:space="preserve">full</w:t>
       </w:r>
     </w:p>
-    <w:bookmarkEnd w:id="35"/>
-    <w:bookmarkStart w:id="36" w:name="checksum-mismatch"/>
+    <w:bookmarkEnd w:id="36"/>
+    <w:bookmarkStart w:id="37" w:name="checksum-mismatch"/>
     <w:p>
       <w:pPr>
         <w:pStyle w:val="Heading3"/>
@@ -2435,8 +2486,8 @@
         <w:t xml:space="preserve">embedded in the installer.</w:t>
       </w:r>
     </w:p>
-    <w:bookmarkEnd w:id="36"/>
-    <w:bookmarkStart w:id="37" w:name="reindex-failed"/>
+    <w:bookmarkEnd w:id="37"/>
+    <w:bookmarkStart w:id="38" w:name="reindex-failed"/>
     <w:p>
       <w:pPr>
         <w:pStyle w:val="Heading3"/>
@@ -2484,8 +2535,8 @@
         <w:t xml:space="preserve">installer.</w:t>
       </w:r>
     </w:p>
-    <w:bookmarkEnd w:id="37"/>
-    <w:bookmarkStart w:id="38" w:name="my-agent-does-not-see-lodestone"/>
+    <w:bookmarkEnd w:id="38"/>
+    <w:bookmarkStart w:id="39" w:name="my-agent-does-not-see-lodestone"/>
     <w:p>
       <w:pPr>
         <w:pStyle w:val="Heading3"/>
@@ -2559,9 +2610,9 @@
         <w:t xml:space="preserve">You restarted the agent after install.</w:t>
       </w:r>
     </w:p>
-    <w:bookmarkEnd w:id="38"/>
     <w:bookmarkEnd w:id="39"/>
-    <w:bookmarkStart w:id="40" w:name="best-first-test"/>
+    <w:bookmarkEnd w:id="40"/>
+    <w:bookmarkStart w:id="41" w:name="best-first-test"/>
     <w:p>
       <w:pPr>
         <w:pStyle w:val="Heading2"/>
@@ -2671,8 +2722,8 @@
         <w:t xml:space="preserve">Review whether the answer points to real files and relationships.</w:t>
       </w:r>
     </w:p>
-    <w:bookmarkEnd w:id="40"/>
     <w:bookmarkEnd w:id="41"/>
+    <w:bookmarkEnd w:id="42"/>
     <w:sectPr>
       <w:headerReference r:id="rId9" w:type="default"/>
       <w:footerReference r:id="rId10" w:type="default"/>

</xml_diff>

<commit_message>
feat(doctor): add generic MCP client checks
</commit_message>
<xml_diff>
--- a/docs/friend/word/Lodestone-Installation-Guide.docx
+++ b/docs/friend/word/Lodestone-Installation-Guide.docx
@@ -1202,6 +1202,104 @@
           <w:rStyle w:val="NormalTok"/>
         </w:rPr>
         <w:t xml:space="preserve"> codex</w:t>
+      </w:r>
+    </w:p>
+    <w:p>
+      <w:pPr>
+        <w:pStyle w:val="FirstParagraph"/>
+      </w:pPr>
+      <w:r>
+        <w:t xml:space="preserve">For Claude Code, Cursor, Cline, cmndclaw, and other clients that use the</w:t>
+      </w:r>
+      <w:r>
+        <w:t xml:space="preserve"> </w:t>
+      </w:r>
+      <w:r>
+        <w:t xml:space="preserve">project</w:t>
+      </w:r>
+      <w:r>
+        <w:t xml:space="preserve"> </w:t>
+      </w:r>
+      <w:r>
+        <w:rPr>
+          <w:rStyle w:val="VerbatimChar"/>
+        </w:rPr>
+        <w:t xml:space="preserve">.mcp.json</w:t>
+      </w:r>
+      <w:r>
+        <w:t xml:space="preserve">, no extra installer option is required. Verify that shared</w:t>
+      </w:r>
+      <w:r>
+        <w:t xml:space="preserve"> </w:t>
+      </w:r>
+      <w:r>
+        <w:t xml:space="preserve">MCP config with:</w:t>
+      </w:r>
+    </w:p>
+    <w:p>
+      <w:pPr>
+        <w:pStyle w:val="SourceCode"/>
+      </w:pPr>
+      <w:r>
+        <w:rPr>
+          <w:rStyle w:val="ExtensionTok"/>
+        </w:rPr>
+        <w:t xml:space="preserve">./node_modules/.bin/lodestone</w:t>
+      </w:r>
+      <w:r>
+        <w:rPr>
+          <w:rStyle w:val="NormalTok"/>
+        </w:rPr>
+        <w:t xml:space="preserve"> doctor </w:t>
+      </w:r>
+      <w:r>
+        <w:rPr>
+          <w:rStyle w:val="AttributeTok"/>
+        </w:rPr>
+        <w:t xml:space="preserve">--client</w:t>
+      </w:r>
+      <w:r>
+        <w:rPr>
+          <w:rStyle w:val="NormalTok"/>
+        </w:rPr>
+        <w:t xml:space="preserve"> mcp</w:t>
+      </w:r>
+    </w:p>
+    <w:p>
+      <w:pPr>
+        <w:pStyle w:val="FirstParagraph"/>
+      </w:pPr>
+      <w:r>
+        <w:t xml:space="preserve">You can also use the matching client name, such as:</w:t>
+      </w:r>
+    </w:p>
+    <w:p>
+      <w:pPr>
+        <w:pStyle w:val="SourceCode"/>
+      </w:pPr>
+      <w:r>
+        <w:rPr>
+          <w:rStyle w:val="ExtensionTok"/>
+        </w:rPr>
+        <w:t xml:space="preserve">./node_modules/.bin/lodestone</w:t>
+      </w:r>
+      <w:r>
+        <w:rPr>
+          <w:rStyle w:val="NormalTok"/>
+        </w:rPr>
+        <w:t xml:space="preserve"> doctor </w:t>
+      </w:r>
+      <w:r>
+        <w:rPr>
+          <w:rStyle w:val="AttributeTok"/>
+        </w:rPr>
+        <w:t xml:space="preserve">--client</w:t>
+      </w:r>
+      <w:r>
+        <w:rPr>
+          <w:rStyle w:val="NormalTok"/>
+        </w:rPr>
+        <w:t xml:space="preserve"> cursor</w:t>
       </w:r>
     </w:p>
     <w:bookmarkStart w:id="25" w:name="claude-desktop-mcpb-option"/>

</xml_diff>

<commit_message>
release: prepare v0.1.9 build metadata
</commit_message>
<xml_diff>
--- a/docs/friend/word/Lodestone-Installation-Guide.docx
+++ b/docs/friend/word/Lodestone-Installation-Guide.docx
@@ -67,7 +67,7 @@
         <w:t xml:space="preserve"> </w:t>
       </w:r>
       <w:r>
-        <w:t xml:space="preserve">v0.1.8 friend-install documentation</w:t>
+        <w:t xml:space="preserve">v0.1.9 friend-install documentation</w:t>
       </w:r>
       <w:r>
         <w:t xml:space="preserve"> </w:t>
@@ -580,7 +580,7 @@
         </w:numPr>
       </w:pPr>
       <w:r>
-        <w:t xml:space="preserve">The approved Lodestone v0.1.8 package set.</w:t>
+        <w:t xml:space="preserve">The approved Lodestone v0.1.9 package set.</w:t>
       </w:r>
     </w:p>
     <w:p>
@@ -821,7 +821,7 @@
         </w:numPr>
       </w:pPr>
       <w:r>
-        <w:t xml:space="preserve">The approved Lodestone v0.1.8 package set.</w:t>
+        <w:t xml:space="preserve">The approved Lodestone v0.1.9 package set.</w:t>
       </w:r>
     </w:p>
     <w:p>

</xml_diff>

<commit_message>
release: prepare v0.1.9 friend installer
* release: prepare v0.1.9 build metadata

* docs: refresh cmndi build metadata

* docs: align v0.1.9 audit wording

* docs: refresh cmndi metadata after v0.1.9 audit fix

* release: add v0.1.9 installer checksums

* docs: clarify v0.1.9 release audit metadata

* docs: refresh cmndi metadata after release doc cleanup

* release: refresh v0.1.9 cli checksum
</commit_message>
<xml_diff>
--- a/docs/friend/word/Lodestone-Installation-Guide.docx
+++ b/docs/friend/word/Lodestone-Installation-Guide.docx
@@ -67,7 +67,7 @@
         <w:t xml:space="preserve"> </w:t>
       </w:r>
       <w:r>
-        <w:t xml:space="preserve">v0.1.8 friend-install documentation</w:t>
+        <w:t xml:space="preserve">v0.1.9 friend-install documentation</w:t>
       </w:r>
       <w:r>
         <w:t xml:space="preserve"> </w:t>
@@ -580,7 +580,7 @@
         </w:numPr>
       </w:pPr>
       <w:r>
-        <w:t xml:space="preserve">The approved Lodestone v0.1.8 package set.</w:t>
+        <w:t xml:space="preserve">The approved Lodestone v0.1.9 package set.</w:t>
       </w:r>
     </w:p>
     <w:p>
@@ -821,7 +821,7 @@
         </w:numPr>
       </w:pPr>
       <w:r>
-        <w:t xml:space="preserve">The approved Lodestone v0.1.8 package set.</w:t>
+        <w:t xml:space="preserve">The approved Lodestone v0.1.9 package set.</w:t>
       </w:r>
     </w:p>
     <w:p>

</xml_diff>

<commit_message>
release: prepare v0.1.10 friend installer
</commit_message>
<xml_diff>
--- a/docs/friend/word/Lodestone-Installation-Guide.docx
+++ b/docs/friend/word/Lodestone-Installation-Guide.docx
@@ -67,7 +67,7 @@
         <w:t xml:space="preserve"> </w:t>
       </w:r>
       <w:r>
-        <w:t xml:space="preserve">v0.1.9 friend-install documentation</w:t>
+        <w:t xml:space="preserve">v0.1.10 friend-install documentation</w:t>
       </w:r>
       <w:r>
         <w:t xml:space="preserve"> </w:t>
@@ -580,7 +580,7 @@
         </w:numPr>
       </w:pPr>
       <w:r>
-        <w:t xml:space="preserve">The approved Lodestone v0.1.9 package set.</w:t>
+        <w:t xml:space="preserve">The approved Lodestone v0.1.10 package set.</w:t>
       </w:r>
     </w:p>
     <w:p>
@@ -821,7 +821,7 @@
         </w:numPr>
       </w:pPr>
       <w:r>
-        <w:t xml:space="preserve">The approved Lodestone v0.1.9 package set.</w:t>
+        <w:t xml:space="preserve">The approved Lodestone v0.1.10 package set.</w:t>
       </w:r>
     </w:p>
     <w:p>

</xml_diff>

<commit_message>
release: prepare v0.1.11 uninstall cleanup
</commit_message>
<xml_diff>
--- a/docs/friend/word/Lodestone-Installation-Guide.docx
+++ b/docs/friend/word/Lodestone-Installation-Guide.docx
@@ -67,7 +67,7 @@
         <w:t xml:space="preserve"> </w:t>
       </w:r>
       <w:r>
-        <w:t xml:space="preserve">v0.1.10 friend-install documentation</w:t>
+        <w:t xml:space="preserve">v0.1.11 friend-install documentation</w:t>
       </w:r>
       <w:r>
         <w:t xml:space="preserve"> </w:t>
@@ -580,7 +580,7 @@
         </w:numPr>
       </w:pPr>
       <w:r>
-        <w:t xml:space="preserve">The approved Lodestone v0.1.10 package set.</w:t>
+        <w:t xml:space="preserve">The approved Lodestone v0.1.11 package set.</w:t>
       </w:r>
     </w:p>
     <w:p>
@@ -821,7 +821,7 @@
         </w:numPr>
       </w:pPr>
       <w:r>
-        <w:t xml:space="preserve">The approved Lodestone v0.1.10 package set.</w:t>
+        <w:t xml:space="preserve">The approved Lodestone v0.1.11 package set.</w:t>
       </w:r>
     </w:p>
     <w:p>

</xml_diff>

<commit_message>
release: prepare v0.1.12 friend installer
</commit_message>
<xml_diff>
--- a/docs/friend/word/Lodestone-Installation-Guide.docx
+++ b/docs/friend/word/Lodestone-Installation-Guide.docx
@@ -67,7 +67,7 @@
         <w:t xml:space="preserve"> </w:t>
       </w:r>
       <w:r>
-        <w:t xml:space="preserve">v0.1.11 friend-install documentation</w:t>
+        <w:t xml:space="preserve">v0.1.12 friend-install documentation</w:t>
       </w:r>
       <w:r>
         <w:t xml:space="preserve"> </w:t>
@@ -580,7 +580,7 @@
         </w:numPr>
       </w:pPr>
       <w:r>
-        <w:t xml:space="preserve">The approved Lodestone v0.1.11 package set.</w:t>
+        <w:t xml:space="preserve">The approved Lodestone v0.1.12 package set.</w:t>
       </w:r>
     </w:p>
     <w:p>
@@ -821,7 +821,7 @@
         </w:numPr>
       </w:pPr>
       <w:r>
-        <w:t xml:space="preserve">The approved Lodestone v0.1.11 package set.</w:t>
+        <w:t xml:space="preserve">The approved Lodestone v0.1.12 package set.</w:t>
       </w:r>
     </w:p>
     <w:p>

</xml_diff>

<commit_message>
feat: add claude code client smoke helper
</commit_message>
<xml_diff>
--- a/docs/friend/word/Lodestone-Installation-Guide.docx
+++ b/docs/friend/word/Lodestone-Installation-Guide.docx
@@ -1303,6 +1303,75 @@
       </w:r>
       <w:r>
         <w:t xml:space="preserve">repo.</w:t>
+      </w:r>
+    </w:p>
+    <w:p>
+      <w:pPr>
+        <w:pStyle w:val="BodyText"/>
+      </w:pPr>
+      <w:r>
+        <w:t xml:space="preserve">For Claude Code, collect the shared MCP support smoke command:</w:t>
+      </w:r>
+    </w:p>
+    <w:p>
+      <w:pPr>
+        <w:pStyle w:val="SourceCode"/>
+      </w:pPr>
+      <w:r>
+        <w:rPr>
+          <w:rStyle w:val="ExtensionTok"/>
+        </w:rPr>
+        <w:t xml:space="preserve">./node_modules/.bin/lodestone</w:t>
+      </w:r>
+      <w:r>
+        <w:rPr>
+          <w:rStyle w:val="NormalTok"/>
+        </w:rPr>
+        <w:t xml:space="preserve"> client-smoke </w:t>
+      </w:r>
+      <w:r>
+        <w:rPr>
+          <w:rStyle w:val="AttributeTok"/>
+        </w:rPr>
+        <w:t xml:space="preserve">--client</w:t>
+      </w:r>
+      <w:r>
+        <w:rPr>
+          <w:rStyle w:val="NormalTok"/>
+        </w:rPr>
+        <w:t xml:space="preserve"> claude-code</w:t>
+      </w:r>
+    </w:p>
+    <w:p>
+      <w:pPr>
+        <w:pStyle w:val="FirstParagraph"/>
+      </w:pPr>
+      <w:r>
+        <w:t xml:space="preserve">This command does not run Claude Code and does not edit global Claude settings.</w:t>
+      </w:r>
+      <w:r>
+        <w:t xml:space="preserve"> </w:t>
+      </w:r>
+      <w:r>
+        <w:t xml:space="preserve">It checks</w:t>
+      </w:r>
+      <w:r>
+        <w:t xml:space="preserve"> </w:t>
+      </w:r>
+      <w:r>
+        <w:rPr>
+          <w:rStyle w:val="VerbatimChar"/>
+        </w:rPr>
+        <w:t xml:space="preserve">.mcp.json</w:t>
+      </w:r>
+      <w:r>
+        <w:t xml:space="preserve">, checks that the local Lodestone MCP launcher exists and</w:t>
+      </w:r>
+      <w:r>
+        <w:t xml:space="preserve"> </w:t>
+      </w:r>
+      <w:r>
+        <w:t xml:space="preserve">is executable, and prints exact Claude Code commands for a trusted smoke repo.</w:t>
       </w:r>
     </w:p>
     <w:p>

</xml_diff>

<commit_message>
release: prepare v0.1.13 friend installer
</commit_message>
<xml_diff>
--- a/docs/friend/word/Lodestone-Installation-Guide.docx
+++ b/docs/friend/word/Lodestone-Installation-Guide.docx
@@ -67,7 +67,7 @@
         <w:t xml:space="preserve"> </w:t>
       </w:r>
       <w:r>
-        <w:t xml:space="preserve">v0.1.12 friend-install documentation</w:t>
+        <w:t xml:space="preserve">v0.1.13 friend-install documentation</w:t>
       </w:r>
       <w:r>
         <w:t xml:space="preserve"> </w:t>
@@ -580,7 +580,7 @@
         </w:numPr>
       </w:pPr>
       <w:r>
-        <w:t xml:space="preserve">The approved Lodestone v0.1.12 package set.</w:t>
+        <w:t xml:space="preserve">The approved Lodestone v0.1.13 package set.</w:t>
       </w:r>
     </w:p>
     <w:p>
@@ -821,7 +821,7 @@
         </w:numPr>
       </w:pPr>
       <w:r>
-        <w:t xml:space="preserve">The approved Lodestone v0.1.12 package set.</w:t>
+        <w:t xml:space="preserve">The approved Lodestone v0.1.13 package set.</w:t>
       </w:r>
     </w:p>
     <w:p>

</xml_diff>

<commit_message>
release: prepare v0.1.14 docs scope
</commit_message>
<xml_diff>
--- a/docs/friend/word/Lodestone-Installation-Guide.docx
+++ b/docs/friend/word/Lodestone-Installation-Guide.docx
@@ -67,7 +67,7 @@
         <w:t xml:space="preserve"> </w:t>
       </w:r>
       <w:r>
-        <w:t xml:space="preserve">v0.1.13 friend-install documentation</w:t>
+        <w:t xml:space="preserve">v0.1.14 friend-install documentation</w:t>
       </w:r>
       <w:r>
         <w:t xml:space="preserve"> </w:t>
@@ -580,7 +580,7 @@
         </w:numPr>
       </w:pPr>
       <w:r>
-        <w:t xml:space="preserve">The approved Lodestone v0.1.13 package set.</w:t>
+        <w:t xml:space="preserve">The approved Lodestone v0.1.14 package set.</w:t>
       </w:r>
     </w:p>
     <w:p>
@@ -821,7 +821,7 @@
         </w:numPr>
       </w:pPr>
       <w:r>
-        <w:t xml:space="preserve">The approved Lodestone v0.1.13 package set.</w:t>
+        <w:t xml:space="preserve">The approved Lodestone v0.1.14 package set.</w:t>
       </w:r>
     </w:p>
     <w:p>
@@ -1486,19 +1486,33 @@
         <w:pStyle w:val="FirstParagraph"/>
       </w:pPr>
       <w:r>
-        <w:t xml:space="preserve">Claude Desktop users who prefer a one-click extension can use a private</w:t>
+        <w:t xml:space="preserve">Claude Desktop MCPB is an operator-preview path, not the default friend install</w:t>
       </w:r>
       <w:r>
         <w:t xml:space="preserve"> </w:t>
       </w:r>
       <w:r>
-        <w:t xml:space="preserve">current-platform MCPB bundle after Lodestone has already been installed and</w:t>
+        <w:t xml:space="preserve">route. The packer and manifest-only structural smoke exist, but a real Claude</w:t>
       </w:r>
       <w:r>
         <w:t xml:space="preserve"> </w:t>
       </w:r>
       <w:r>
-        <w:t xml:space="preserve">indexed in the target project. See</w:t>
+        <w:t xml:space="preserve">Desktop install/use smoke has not yet been captured on this maintainer host.</w:t>
+      </w:r>
+    </w:p>
+    <w:p>
+      <w:pPr>
+        <w:pStyle w:val="BodyText"/>
+      </w:pPr>
+      <w:r>
+        <w:t xml:space="preserve">Use the public Lite or Full installer as the supported friend path. Only use</w:t>
+      </w:r>
+      <w:r>
+        <w:t xml:space="preserve"> </w:t>
+      </w:r>
+      <w:r>
+        <w:t xml:space="preserve">MCPB after a maintainer has built and validated a bundle for your platform. See</w:t>
       </w:r>
       <w:r>
         <w:t xml:space="preserve"> </w:t>
@@ -1513,13 +1527,7 @@
         <w:t xml:space="preserve"> </w:t>
       </w:r>
       <w:r>
-        <w:t xml:space="preserve">or the online docs page for</w:t>
-      </w:r>
-      <w:r>
-        <w:t xml:space="preserve"> </w:t>
-      </w:r>
-      <w:r>
-        <w:t xml:space="preserve">the bundle build and install steps.</w:t>
+        <w:t xml:space="preserve">or the online docs page for the preview bundle steps.</w:t>
       </w:r>
     </w:p>
     <w:bookmarkEnd w:id="25"/>

</xml_diff>

<commit_message>
release: prepare v0.1.15 friend installer
</commit_message>
<xml_diff>
--- a/docs/friend/word/Lodestone-Installation-Guide.docx
+++ b/docs/friend/word/Lodestone-Installation-Guide.docx
@@ -67,7 +67,7 @@
         <w:t xml:space="preserve"> </w:t>
       </w:r>
       <w:r>
-        <w:t xml:space="preserve">v0.1.14 friend-install documentation</w:t>
+        <w:t xml:space="preserve">v0.1.15 friend-install documentation</w:t>
       </w:r>
       <w:r>
         <w:t xml:space="preserve"> </w:t>
@@ -580,7 +580,7 @@
         </w:numPr>
       </w:pPr>
       <w:r>
-        <w:t xml:space="preserve">The approved Lodestone v0.1.14 package set.</w:t>
+        <w:t xml:space="preserve">The approved Lodestone v0.1.15 package set.</w:t>
       </w:r>
     </w:p>
     <w:p>
@@ -821,7 +821,7 @@
         </w:numPr>
       </w:pPr>
       <w:r>
-        <w:t xml:space="preserve">The approved Lodestone v0.1.14 package set.</w:t>
+        <w:t xml:space="preserve">The approved Lodestone v0.1.15 package set.</w:t>
       </w:r>
     </w:p>
     <w:p>

</xml_diff>

<commit_message>
release: publish v0.1.15 installer metadata (#23)
* release: prepare v0.1.15 friend installer

* release: add v0.1.15 checksums
</commit_message>
<xml_diff>
--- a/docs/friend/word/Lodestone-Installation-Guide.docx
+++ b/docs/friend/word/Lodestone-Installation-Guide.docx
@@ -67,7 +67,7 @@
         <w:t xml:space="preserve"> </w:t>
       </w:r>
       <w:r>
-        <w:t xml:space="preserve">v0.1.14 friend-install documentation</w:t>
+        <w:t xml:space="preserve">v0.1.15 friend-install documentation</w:t>
       </w:r>
       <w:r>
         <w:t xml:space="preserve"> </w:t>
@@ -580,7 +580,7 @@
         </w:numPr>
       </w:pPr>
       <w:r>
-        <w:t xml:space="preserve">The approved Lodestone v0.1.14 package set.</w:t>
+        <w:t xml:space="preserve">The approved Lodestone v0.1.15 package set.</w:t>
       </w:r>
     </w:p>
     <w:p>
@@ -821,7 +821,7 @@
         </w:numPr>
       </w:pPr>
       <w:r>
-        <w:t xml:space="preserve">The approved Lodestone v0.1.14 package set.</w:t>
+        <w:t xml:space="preserve">The approved Lodestone v0.1.15 package set.</w:t>
       </w:r>
     </w:p>
     <w:p>

</xml_diff>